<commit_message>
feat: depurar catalogo a los 6 cursos activos autorizados y sincronizar en toda la plataforma
</commit_message>
<xml_diff>
--- a/Requerimientos_Funcionales_y_No_Funcionales_PrevySeg.docx
+++ b/Requerimientos_Funcionales_y_No_Funcionales_PrevySeg.docx
@@ -1109,7 +1109,7 @@
                 <w:sz w:val="18"/>
                 <w:szCs w:val="18"/>
               </w:rPr>
-              <w:t xml:space="preserve">El sistema debe desplegar la oferta académica compuesta por los 11 programas oficiales autorizados por SENCE y OS-10 de Carabineros, presentando tarjetas visuales con portadas geométricas/fotográficas, categoría, títulos oficiales sin descripciones extensas y arancel al pie.</w:t>
+              <w:t xml:space="preserve">El sistema debe desplegar la oferta académica compuesta por los 6 programas oficiales activos autorizados por SENCE y OS-10 de Carabineros, presentando tarjetas visuales con portadas geométricas/fotográficas, categoría, títulos oficiales sin descripciones extensas y arancel al pie.</w:t>
             </w:r>
           </w:p>
         </w:tc>
@@ -1286,7 +1286,7 @@
                 <w:sz w:val="18"/>
                 <w:szCs w:val="18"/>
               </w:rPr>
-              <w:t xml:space="preserve">El usuario podrá filtrar el catálogo según las categorías: Seguridad Privada, Agrícola, Sistemas Internos, Asistencias y Originales, actualizando la vista de inmediato sin recargar la página.</w:t>
+              <w:t xml:space="preserve">El usuario podrá filtrar el catálogo según las categorías activas: Seguridad Privada, Sistemas Internos y Asistencias, actualizando la vista de inmediato sin recargar la página.</w:t>
             </w:r>
           </w:p>
         </w:tc>

</xml_diff>